<commit_message>
update: replace and add FRP manuscript and report files in various formats
</commit_message>
<xml_diff>
--- a/SEM_8/FRP/FRP Manuscript.docx
+++ b/SEM_8/FRP/FRP Manuscript.docx
@@ -729,7 +729,63 @@
         <w:rPr>
           <w:rFonts w:hint="default"/>
         </w:rPr>
-        <w:t>Machine learning in static code analysis has been well researched as an approach for tackling the problem of false positive alerts. According to research conducted by Apostolidis et al. (2025), the use of AI in static analysis was proven effective in filtering outputs generated by CppCheck software, utilizing a customized version of CodeBERT. Nonetheless, it was found that vulnerability prediction models developed by Apostolidis et al. lack line-level accuracy, thus making static tools vulnerable to the issue of too many false alarms. Additionally, in their systematic review of 130 mitigation efforts, Guo et al. (2023) highlighted how the current generation of deep learning and NLP methods suffers from poor explainability, ambiguous definitions of concepts, and dataset bias. Lastly, in his work on the adaptation of LLMs, Jin (2025) described various approaches, among which include base application, static augmentation, RAG, and hybrid fusion.</w:t>
+        <w:t>Machine learning in static code analysis has been well researched as an approach for tackling the problem of false positive alerts. According to research conducted by Apostolidis et al. (2025)</w:t>
+      </w:r>
+      <w:r>
+        <w:rPr>
+          <w:rFonts w:hint="default"/>
+          <w:vertAlign w:val="superscript"/>
+          <w:lang w:val="en-US"/>
+        </w:rPr>
+        <w:t>[1]</w:t>
+      </w:r>
+      <w:r>
+        <w:rPr>
+          <w:rFonts w:hint="default"/>
+        </w:rPr>
+        <w:t>, the use of AI in static analysis was proven effective in filtering outputs generated by CppCheck software, utilizing a customized version of CodeBERT. Nonetheless, it was found that vulnerability prediction models developed by Apostolidis et al</w:t>
+      </w:r>
+      <w:r>
+        <w:rPr>
+          <w:rFonts w:hint="default"/>
+          <w:vertAlign w:val="superscript"/>
+          <w:lang w:val="en-US"/>
+        </w:rPr>
+        <w:t>[1]</w:t>
+      </w:r>
+      <w:r>
+        <w:rPr>
+          <w:rFonts w:hint="default"/>
+        </w:rPr>
+        <w:t>. lack line-level accuracy, thus making static tools vulnerable to the issue of too many false alarms. Additionally, in their systematic review of 130 mitigation efforts, Guo et al. (2023)</w:t>
+      </w:r>
+      <w:r>
+        <w:rPr>
+          <w:rFonts w:hint="default"/>
+          <w:vertAlign w:val="superscript"/>
+          <w:lang w:val="en-US"/>
+        </w:rPr>
+        <w:t>[3]</w:t>
+      </w:r>
+      <w:r>
+        <w:rPr>
+          <w:rFonts w:hint="default"/>
+        </w:rPr>
+        <w:t xml:space="preserve"> highlighted how the current generation of deep learning and NLP methods suffers from poor explainability, ambiguous definitions of concepts, and dataset bias. Lastly, in his work on the adaptation of LLMs, Jin (2025)</w:t>
+      </w:r>
+      <w:r>
+        <w:rPr>
+          <w:rFonts w:hint="default"/>
+          <w:vertAlign w:val="superscript"/>
+          <w:lang w:val="en-US"/>
+        </w:rPr>
+        <w:t>[4]</w:t>
+      </w:r>
+      <w:r>
+        <w:rPr>
+          <w:rFonts w:hint="default"/>
+        </w:rPr>
+        <w:t xml:space="preserve"> described various approaches, among which include base application, static augmentation, RAG, and hybrid fusion.</w:t>
       </w:r>
     </w:p>
     <w:p>
@@ -750,7 +806,49 @@
         <w:rPr>
           <w:rFonts w:hint="default"/>
         </w:rPr>
-        <w:t>Recent efforts have tried to direct the attention of LLMs towards localized semantics to overcome context blindness. Li et al. (2025) obtained a boost in their F1-score of 12.86% by directly injecting vulnerability steering vectors into LLM activation layers using actual data. However, current techniques for representation are mainly based on file semantics rather than identifying localized vulnerabilities. Kim et al. (2025) further validated this issue by implementing reinforcement learning to identify contextual signals, highlighting how conventional LLM models inherently fail when faced with vague tasks requiring context extraction. Classical data flow models, as presented by Muske and Khedker (2015), were able to accelerate processing speeds by reducing model check calls; however, they lacked detection accuracy because of path over-approximation.</w:t>
+        <w:t>Recent efforts have tried to direct the attention of LLMs towards localized semantics to overcome context blindness. Li et al. (2025)</w:t>
+      </w:r>
+      <w:r>
+        <w:rPr>
+          <w:rFonts w:hint="default"/>
+          <w:vertAlign w:val="superscript"/>
+          <w:lang w:val="en-US"/>
+        </w:rPr>
+        <w:t>[6]</w:t>
+      </w:r>
+      <w:r>
+        <w:rPr>
+          <w:rFonts w:hint="default"/>
+        </w:rPr>
+        <w:t xml:space="preserve"> obtained a boost in their F1-score of 12.86% by directly injecting vulnerability steering vectors into LLM activation layers using actual data. However, current techniques for representation are mainly based on file semantics rather than identifying localized vulnerabilities. Kim et al. (2025)</w:t>
+      </w:r>
+      <w:r>
+        <w:rPr>
+          <w:rFonts w:hint="default"/>
+          <w:vertAlign w:val="superscript"/>
+          <w:lang w:val="en-US"/>
+        </w:rPr>
+        <w:t>[5]</w:t>
+      </w:r>
+      <w:r>
+        <w:rPr>
+          <w:rFonts w:hint="default"/>
+        </w:rPr>
+        <w:t xml:space="preserve"> further validated this issue by implementing reinforcement learning to identify contextual signals, highlighting how conventional LLM models inherently fail when faced with vague tasks requiring context extraction. Classical data flow models, as presented by Muske and Khedker (2015)</w:t>
+      </w:r>
+      <w:r>
+        <w:rPr>
+          <w:rFonts w:hint="default"/>
+          <w:vertAlign w:val="superscript"/>
+          <w:lang w:val="en-US"/>
+        </w:rPr>
+        <w:t>[7]</w:t>
+      </w:r>
+      <w:r>
+        <w:rPr>
+          <w:rFonts w:hint="default"/>
+        </w:rPr>
+        <w:t>, were able to accelerate processing speeds by reducing model check calls; however, they lacked detection accuracy because of path over-approximation.</w:t>
       </w:r>
     </w:p>
     <w:p>
@@ -772,7 +870,23 @@
         <w:rPr>
           <w:rFonts w:hint="default"/>
         </w:rPr>
-        <w:t>Crucially, empirically derived tests have identified serious problems in the way LLM security benchmarks are being assessed. In a startling finding, Dozono et al. (2025) found a devastating decline in accuracy from 56% in open source software to 34% in closed source commercial software, indicating that present day LLM security is overstated owing to contaminated training data sets. Lastly, moving LLM defenses solely to a reactive defense mechanism makes systems highly vulnerable to prompt injection attacks, requiring pre-inference structural verification.</w:t>
+        <w:t>Crucially, empirically derived tests have identified serious problems in the way LLM security benchmarks are being assessed. In a startling finding, Dozono et al. (2025)</w:t>
+      </w:r>
+      <w:r>
+        <w:rPr>
+          <w:rFonts w:hint="default"/>
+          <w:vertAlign w:val="superscript"/>
+          <w:lang w:val="en-US"/>
+        </w:rPr>
+        <w:t>[2]</w:t>
+      </w:r>
+      <w:bookmarkStart w:id="0" w:name="_GoBack"/>
+      <w:bookmarkEnd w:id="0"/>
+      <w:r>
+        <w:rPr>
+          <w:rFonts w:hint="default"/>
+        </w:rPr>
+        <w:t xml:space="preserve"> found a devastating decline in accuracy from 56% in open source software to 34% in closed source commercial software, indicating that present day LLM security is overstated owing to contaminated training data sets. Lastly, moving LLM defenses solely to a reactive defense mechanism makes systems highly vulnerable to prompt injection attacks, requiring pre-inference structural verification.</w:t>
       </w:r>
     </w:p>
     <w:p>
@@ -1620,6 +1734,8 @@
       <w:r>
         <w:rPr>
           <w:b/>
+          <w:sz w:val="24"/>
+          <w:szCs w:val="24"/>
         </w:rPr>
         <w:t>References</w:t>
       </w:r>
@@ -1765,15 +1881,7 @@
         <w:rPr>
           <w:rFonts w:hint="default"/>
         </w:rPr>
-        <w:t>Schwarz, D. (2025) 'Countermind: A Multi-Layered Security Architecture for Large Language Models',</w:t>
-      </w:r>
-      <w:bookmarkStart w:id="3" w:name="_GoBack"/>
-      <w:bookmarkEnd w:id="3"/>
-      <w:r>
-        <w:rPr>
-          <w:rFonts w:hint="default"/>
-        </w:rPr>
-        <w:t xml:space="preserve"> arXiv preprint arXiv:2510.11837v1.</w:t>
+        <w:t>Schwarz, D. (2025) 'Countermind: A Multi-Layered Security Architecture for Large Language Models', arXiv preprint arXiv:2510.11837v1.</w:t>
       </w:r>
     </w:p>
     <w:p/>
@@ -1791,957 +1899,9 @@
     <w:p/>
     <w:p/>
     <w:p>
-      <w:r>
-        <w:br w:type="page"/>
-      </w:r>
-    </w:p>
-    <w:p>
-      <w:pPr>
-        <w:pStyle w:val="26"/>
-        <w:numPr>
-          <w:ilvl w:val="0"/>
-          <w:numId w:val="0"/>
-        </w:numPr>
-        <w:spacing w:before="0"/>
-      </w:pPr>
-      <w:r>
-        <w:t>GUIDELINES FOR WRITING THE MANUSCRIPT</w:t>
-      </w:r>
-    </w:p>
-    <w:p>
-      <w:pPr>
-        <w:pStyle w:val="3"/>
-      </w:pPr>
-      <w:r>
-        <w:t>Please note that the first paragraph of a section or subsection is not indented. The first paragraphs that follows a table, figure, equation etc. does not have an indent, either.</w:t>
-      </w:r>
-    </w:p>
-    <w:p>
-      <w:r>
-        <w:t>Subsequent paragraphs, however, are indented.</w:t>
-      </w:r>
-    </w:p>
-    <w:p>
-      <w:pPr>
-        <w:pStyle w:val="5"/>
-      </w:pPr>
-      <w:r>
-        <w:rPr>
-          <w:rStyle w:val="27"/>
-        </w:rPr>
-        <w:t xml:space="preserve">Sample Heading (Third Level). </w:t>
-      </w:r>
-      <w:r>
-        <w:rPr>
-          <w:rStyle w:val="27"/>
-          <w:b w:val="0"/>
-        </w:rPr>
-        <w:t>Only two levels of headings should be numbered. Lower level headings remain unnumbered; they are formatted as run-in headings.</w:t>
-      </w:r>
-    </w:p>
-    <w:p>
-      <w:pPr>
-        <w:pStyle w:val="6"/>
-        <w:rPr>
-          <w:rStyle w:val="28"/>
-          <w:i w:val="0"/>
-        </w:rPr>
-      </w:pPr>
-      <w:r>
-        <w:rPr>
-          <w:rStyle w:val="28"/>
-        </w:rPr>
-        <w:t>Sample Heading (Forth Level).</w:t>
-      </w:r>
-      <w:r>
-        <w:rPr>
-          <w:rStyle w:val="28"/>
-          <w:i w:val="0"/>
-        </w:rPr>
-        <w:t xml:space="preserve"> The contribution should contain no more than four levels of headings. The following </w:t>
-      </w:r>
-      <w:r>
-        <w:fldChar w:fldCharType="begin"/>
-      </w:r>
-      <w:r>
-        <w:instrText xml:space="preserve"> REF _Ref467509391 \h  \* MERGEFORMAT </w:instrText>
-      </w:r>
-      <w:r>
-        <w:fldChar w:fldCharType="separate"/>
-      </w:r>
-      <w:r>
-        <w:t>Table 1</w:t>
-      </w:r>
-      <w:r>
-        <w:fldChar w:fldCharType="end"/>
-      </w:r>
-      <w:r>
-        <w:rPr>
-          <w:rStyle w:val="28"/>
-          <w:i w:val="0"/>
-        </w:rPr>
-        <w:t xml:space="preserve"> gives a summary of all heading levels.</w:t>
-      </w:r>
-    </w:p>
-    <w:p>
-      <w:pPr>
-        <w:pStyle w:val="38"/>
-      </w:pPr>
-      <w:bookmarkStart w:id="0" w:name="_Ref467509391"/>
-      <w:r>
-        <w:rPr>
-          <w:b/>
-        </w:rPr>
-        <w:t xml:space="preserve">Table </w:t>
-      </w:r>
-      <w:r>
-        <w:fldChar w:fldCharType="begin"/>
-      </w:r>
-      <w:r>
-        <w:instrText xml:space="preserve"> SEQ "Table" \* MERGEFORMAT </w:instrText>
-      </w:r>
-      <w:r>
-        <w:fldChar w:fldCharType="separate"/>
-      </w:r>
-      <w:r>
-        <w:rPr>
-          <w:b/>
-        </w:rPr>
-        <w:t>1</w:t>
-      </w:r>
-      <w:r>
-        <w:rPr>
-          <w:b/>
-        </w:rPr>
-        <w:fldChar w:fldCharType="end"/>
-      </w:r>
-      <w:bookmarkEnd w:id="0"/>
-      <w:r>
-        <w:rPr>
-          <w:b/>
-        </w:rPr>
-        <w:t>.</w:t>
-      </w:r>
-      <w:r>
-        <w:t xml:space="preserve"> Table captions should be placed above the tables.</w:t>
-      </w:r>
-    </w:p>
-    <w:tbl>
-      <w:tblPr>
-        <w:tblStyle w:val="8"/>
-        <w:tblW w:w="6889" w:type="dxa"/>
-        <w:jc w:val="center"/>
-        <w:tblLayout w:type="fixed"/>
-        <w:tblCellMar>
-          <w:top w:w="0" w:type="dxa"/>
-          <w:left w:w="70" w:type="dxa"/>
-          <w:bottom w:w="0" w:type="dxa"/>
-          <w:right w:w="70" w:type="dxa"/>
-        </w:tblCellMar>
-      </w:tblPr>
-      <w:tblGrid>
-        <w:gridCol w:w="1692"/>
-        <w:gridCol w:w="3444"/>
-        <w:gridCol w:w="1753"/>
-      </w:tblGrid>
-      <w:tr>
-        <w:trPr>
-          <w:jc w:val="center"/>
-        </w:trPr>
-        <w:tc>
-          <w:tcPr>
-            <w:tcW w:w="1664" w:type="dxa"/>
-            <w:tcBorders>
-              <w:top w:val="single" w:color="000000" w:sz="12" w:space="0"/>
-              <w:bottom w:val="single" w:color="000000" w:sz="6" w:space="0"/>
-            </w:tcBorders>
-          </w:tcPr>
-          <w:p>
-            <w:pPr>
-              <w:ind w:firstLine="0"/>
-              <w:jc w:val="left"/>
-              <w:rPr>
-                <w:sz w:val="18"/>
-                <w:szCs w:val="18"/>
-              </w:rPr>
-            </w:pPr>
-            <w:r>
-              <w:rPr>
-                <w:sz w:val="18"/>
-                <w:szCs w:val="18"/>
-              </w:rPr>
-              <w:t>Heading level</w:t>
-            </w:r>
-          </w:p>
-        </w:tc>
-        <w:tc>
-          <w:tcPr>
-            <w:tcW w:w="3387" w:type="dxa"/>
-            <w:tcBorders>
-              <w:top w:val="single" w:color="000000" w:sz="12" w:space="0"/>
-              <w:bottom w:val="single" w:color="000000" w:sz="6" w:space="0"/>
-            </w:tcBorders>
-          </w:tcPr>
-          <w:p>
-            <w:pPr>
-              <w:ind w:firstLine="0"/>
-              <w:jc w:val="left"/>
-              <w:rPr>
-                <w:sz w:val="18"/>
-                <w:szCs w:val="18"/>
-              </w:rPr>
-            </w:pPr>
-            <w:r>
-              <w:rPr>
-                <w:sz w:val="18"/>
-                <w:szCs w:val="18"/>
-              </w:rPr>
-              <w:t>Example</w:t>
-            </w:r>
-          </w:p>
-        </w:tc>
-        <w:tc>
-          <w:tcPr>
-            <w:tcW w:w="1724" w:type="dxa"/>
-            <w:tcBorders>
-              <w:top w:val="single" w:color="000000" w:sz="12" w:space="0"/>
-              <w:bottom w:val="single" w:color="000000" w:sz="6" w:space="0"/>
-            </w:tcBorders>
-          </w:tcPr>
-          <w:p>
-            <w:pPr>
-              <w:ind w:firstLine="0"/>
-              <w:jc w:val="left"/>
-              <w:rPr>
-                <w:sz w:val="18"/>
-                <w:szCs w:val="18"/>
-              </w:rPr>
-            </w:pPr>
-            <w:r>
-              <w:rPr>
-                <w:sz w:val="18"/>
-                <w:szCs w:val="18"/>
-              </w:rPr>
-              <w:t>Font size and style</w:t>
-            </w:r>
-          </w:p>
-        </w:tc>
-      </w:tr>
-      <w:tr>
-        <w:trPr>
-          <w:trHeight w:val="284" w:hRule="atLeast"/>
-          <w:jc w:val="center"/>
-        </w:trPr>
-        <w:tc>
-          <w:tcPr>
-            <w:tcW w:w="1664" w:type="dxa"/>
-            <w:vAlign w:val="center"/>
-          </w:tcPr>
-          <w:p>
-            <w:pPr>
-              <w:ind w:firstLine="0"/>
-              <w:jc w:val="left"/>
-              <w:rPr>
-                <w:sz w:val="18"/>
-                <w:szCs w:val="18"/>
-              </w:rPr>
-            </w:pPr>
-            <w:r>
-              <w:rPr>
-                <w:sz w:val="18"/>
-                <w:szCs w:val="18"/>
-              </w:rPr>
-              <w:t>Title (centered)</w:t>
-            </w:r>
-          </w:p>
-        </w:tc>
-        <w:tc>
-          <w:tcPr>
-            <w:tcW w:w="3387" w:type="dxa"/>
-            <w:vAlign w:val="center"/>
-          </w:tcPr>
-          <w:p>
-            <w:pPr>
-              <w:ind w:firstLine="0"/>
-              <w:jc w:val="left"/>
-              <w:rPr>
-                <w:sz w:val="18"/>
-                <w:szCs w:val="18"/>
-              </w:rPr>
-            </w:pPr>
-            <w:r>
-              <w:rPr>
-                <w:b/>
-                <w:bCs/>
-                <w:sz w:val="28"/>
-                <w:szCs w:val="25"/>
-              </w:rPr>
-              <w:t>Lecture Notes</w:t>
-            </w:r>
-          </w:p>
-        </w:tc>
-        <w:tc>
-          <w:tcPr>
-            <w:tcW w:w="1724" w:type="dxa"/>
-            <w:vAlign w:val="center"/>
-          </w:tcPr>
-          <w:p>
-            <w:pPr>
-              <w:ind w:firstLine="0"/>
-              <w:jc w:val="left"/>
-              <w:rPr>
-                <w:sz w:val="18"/>
-                <w:szCs w:val="18"/>
-              </w:rPr>
-            </w:pPr>
-            <w:r>
-              <w:rPr>
-                <w:sz w:val="18"/>
-                <w:szCs w:val="18"/>
-              </w:rPr>
-              <w:t>14 point, bold</w:t>
-            </w:r>
-          </w:p>
-        </w:tc>
-      </w:tr>
-      <w:tr>
-        <w:trPr>
-          <w:trHeight w:val="284" w:hRule="atLeast"/>
-          <w:jc w:val="center"/>
-        </w:trPr>
-        <w:tc>
-          <w:tcPr>
-            <w:tcW w:w="1664" w:type="dxa"/>
-            <w:vAlign w:val="center"/>
-          </w:tcPr>
-          <w:p>
-            <w:pPr>
-              <w:ind w:firstLine="0"/>
-              <w:jc w:val="left"/>
-              <w:rPr>
-                <w:sz w:val="18"/>
-                <w:szCs w:val="18"/>
-              </w:rPr>
-            </w:pPr>
-            <w:r>
-              <w:rPr>
-                <w:sz w:val="18"/>
-                <w:szCs w:val="18"/>
-              </w:rPr>
-              <w:t>1</w:t>
-            </w:r>
-            <w:r>
-              <w:rPr>
-                <w:sz w:val="18"/>
-                <w:szCs w:val="18"/>
-                <w:vertAlign w:val="superscript"/>
-              </w:rPr>
-              <w:t>st</w:t>
-            </w:r>
-            <w:r>
-              <w:rPr>
-                <w:sz w:val="18"/>
-                <w:szCs w:val="18"/>
-              </w:rPr>
-              <w:t>-level heading</w:t>
-            </w:r>
-          </w:p>
-        </w:tc>
-        <w:tc>
-          <w:tcPr>
-            <w:tcW w:w="3387" w:type="dxa"/>
-            <w:vAlign w:val="center"/>
-          </w:tcPr>
-          <w:p>
-            <w:pPr>
-              <w:ind w:firstLine="0"/>
-              <w:jc w:val="left"/>
-              <w:rPr>
-                <w:sz w:val="18"/>
-                <w:szCs w:val="18"/>
-              </w:rPr>
-            </w:pPr>
-            <w:r>
-              <w:rPr>
-                <w:b/>
-                <w:bCs/>
-                <w:sz w:val="24"/>
-                <w:szCs w:val="21"/>
-              </w:rPr>
-              <w:t>1 Introduction</w:t>
-            </w:r>
-          </w:p>
-        </w:tc>
-        <w:tc>
-          <w:tcPr>
-            <w:tcW w:w="1724" w:type="dxa"/>
-            <w:vAlign w:val="center"/>
-          </w:tcPr>
-          <w:p>
-            <w:pPr>
-              <w:ind w:firstLine="0"/>
-              <w:jc w:val="left"/>
-              <w:rPr>
-                <w:sz w:val="18"/>
-                <w:szCs w:val="18"/>
-              </w:rPr>
-            </w:pPr>
-            <w:r>
-              <w:rPr>
-                <w:sz w:val="18"/>
-                <w:szCs w:val="18"/>
-              </w:rPr>
-              <w:t>12 point, bold</w:t>
-            </w:r>
-          </w:p>
-        </w:tc>
-      </w:tr>
-      <w:tr>
-        <w:trPr>
-          <w:trHeight w:val="284" w:hRule="atLeast"/>
-          <w:jc w:val="center"/>
-        </w:trPr>
-        <w:tc>
-          <w:tcPr>
-            <w:tcW w:w="1664" w:type="dxa"/>
-            <w:vAlign w:val="center"/>
-          </w:tcPr>
-          <w:p>
-            <w:pPr>
-              <w:ind w:firstLine="0"/>
-              <w:jc w:val="left"/>
-              <w:rPr>
-                <w:sz w:val="18"/>
-                <w:szCs w:val="18"/>
-              </w:rPr>
-            </w:pPr>
-            <w:r>
-              <w:rPr>
-                <w:sz w:val="18"/>
-                <w:szCs w:val="18"/>
-              </w:rPr>
-              <w:t>2</w:t>
-            </w:r>
-            <w:r>
-              <w:rPr>
-                <w:sz w:val="18"/>
-                <w:szCs w:val="18"/>
-                <w:vertAlign w:val="superscript"/>
-              </w:rPr>
-              <w:t>nd</w:t>
-            </w:r>
-            <w:r>
-              <w:rPr>
-                <w:sz w:val="18"/>
-                <w:szCs w:val="18"/>
-              </w:rPr>
-              <w:t>-level heading</w:t>
-            </w:r>
-          </w:p>
-        </w:tc>
-        <w:tc>
-          <w:tcPr>
-            <w:tcW w:w="3387" w:type="dxa"/>
-            <w:vAlign w:val="center"/>
-          </w:tcPr>
-          <w:p>
-            <w:pPr>
-              <w:ind w:firstLine="0"/>
-              <w:jc w:val="left"/>
-              <w:rPr>
-                <w:sz w:val="18"/>
-                <w:szCs w:val="18"/>
-              </w:rPr>
-            </w:pPr>
-            <w:r>
-              <w:rPr>
-                <w:b/>
-                <w:bCs/>
-                <w:szCs w:val="18"/>
-              </w:rPr>
-              <w:t>2.1 Printing Area</w:t>
-            </w:r>
-          </w:p>
-        </w:tc>
-        <w:tc>
-          <w:tcPr>
-            <w:tcW w:w="1724" w:type="dxa"/>
-            <w:vAlign w:val="center"/>
-          </w:tcPr>
-          <w:p>
-            <w:pPr>
-              <w:ind w:firstLine="0"/>
-              <w:jc w:val="left"/>
-              <w:rPr>
-                <w:sz w:val="18"/>
-                <w:szCs w:val="18"/>
-              </w:rPr>
-            </w:pPr>
-            <w:r>
-              <w:rPr>
-                <w:sz w:val="18"/>
-                <w:szCs w:val="18"/>
-              </w:rPr>
-              <w:t>10 point, bold</w:t>
-            </w:r>
-          </w:p>
-        </w:tc>
-      </w:tr>
-      <w:tr>
-        <w:trPr>
-          <w:trHeight w:val="284" w:hRule="atLeast"/>
-          <w:jc w:val="center"/>
-        </w:trPr>
-        <w:tc>
-          <w:tcPr>
-            <w:tcW w:w="1664" w:type="dxa"/>
-            <w:vAlign w:val="center"/>
-          </w:tcPr>
-          <w:p>
-            <w:pPr>
-              <w:ind w:firstLine="0"/>
-              <w:jc w:val="left"/>
-              <w:rPr>
-                <w:sz w:val="18"/>
-                <w:szCs w:val="18"/>
-              </w:rPr>
-            </w:pPr>
-            <w:r>
-              <w:rPr>
-                <w:sz w:val="18"/>
-                <w:szCs w:val="18"/>
-              </w:rPr>
-              <w:t>3</w:t>
-            </w:r>
-            <w:r>
-              <w:rPr>
-                <w:sz w:val="18"/>
-                <w:szCs w:val="18"/>
-                <w:vertAlign w:val="superscript"/>
-              </w:rPr>
-              <w:t>rd</w:t>
-            </w:r>
-            <w:r>
-              <w:rPr>
-                <w:sz w:val="18"/>
-                <w:szCs w:val="18"/>
-              </w:rPr>
-              <w:t>-level heading</w:t>
-            </w:r>
-          </w:p>
-        </w:tc>
-        <w:tc>
-          <w:tcPr>
-            <w:tcW w:w="3387" w:type="dxa"/>
-            <w:vAlign w:val="center"/>
-          </w:tcPr>
-          <w:p>
-            <w:pPr>
-              <w:ind w:firstLine="0"/>
-              <w:jc w:val="left"/>
-              <w:rPr>
-                <w:sz w:val="18"/>
-                <w:szCs w:val="18"/>
-              </w:rPr>
-            </w:pPr>
-            <w:r>
-              <w:rPr>
-                <w:b/>
-                <w:bCs/>
-                <w:szCs w:val="18"/>
-              </w:rPr>
-              <w:t>Run-in Heading in Bold.</w:t>
-            </w:r>
-            <w:r>
-              <w:rPr>
-                <w:szCs w:val="18"/>
-              </w:rPr>
-              <w:t xml:space="preserve"> Text follows</w:t>
-            </w:r>
-          </w:p>
-        </w:tc>
-        <w:tc>
-          <w:tcPr>
-            <w:tcW w:w="1724" w:type="dxa"/>
-            <w:vAlign w:val="center"/>
-          </w:tcPr>
-          <w:p>
-            <w:pPr>
-              <w:ind w:firstLine="0"/>
-              <w:jc w:val="left"/>
-              <w:rPr>
-                <w:sz w:val="18"/>
-                <w:szCs w:val="18"/>
-              </w:rPr>
-            </w:pPr>
-            <w:r>
-              <w:rPr>
-                <w:sz w:val="18"/>
-                <w:szCs w:val="18"/>
-              </w:rPr>
-              <w:t>10 point, bold</w:t>
-            </w:r>
-          </w:p>
-        </w:tc>
-      </w:tr>
-      <w:tr>
-        <w:trPr>
-          <w:trHeight w:val="284" w:hRule="atLeast"/>
-          <w:jc w:val="center"/>
-        </w:trPr>
-        <w:tc>
-          <w:tcPr>
-            <w:tcW w:w="1664" w:type="dxa"/>
-            <w:tcBorders>
-              <w:bottom w:val="single" w:color="000000" w:sz="12" w:space="0"/>
-            </w:tcBorders>
-            <w:vAlign w:val="center"/>
-          </w:tcPr>
-          <w:p>
-            <w:pPr>
-              <w:ind w:firstLine="0"/>
-              <w:jc w:val="left"/>
-              <w:rPr>
-                <w:sz w:val="18"/>
-                <w:szCs w:val="18"/>
-              </w:rPr>
-            </w:pPr>
-            <w:r>
-              <w:rPr>
-                <w:sz w:val="18"/>
-                <w:szCs w:val="18"/>
-              </w:rPr>
-              <w:t>4</w:t>
-            </w:r>
-            <w:r>
-              <w:rPr>
-                <w:sz w:val="18"/>
-                <w:szCs w:val="18"/>
-                <w:vertAlign w:val="superscript"/>
-              </w:rPr>
-              <w:t>th</w:t>
-            </w:r>
-            <w:r>
-              <w:rPr>
-                <w:sz w:val="18"/>
-                <w:szCs w:val="18"/>
-              </w:rPr>
-              <w:t>-level heading</w:t>
-            </w:r>
-          </w:p>
-        </w:tc>
-        <w:tc>
-          <w:tcPr>
-            <w:tcW w:w="3387" w:type="dxa"/>
-            <w:tcBorders>
-              <w:bottom w:val="single" w:color="000000" w:sz="12" w:space="0"/>
-            </w:tcBorders>
-            <w:vAlign w:val="center"/>
-          </w:tcPr>
-          <w:p>
-            <w:pPr>
-              <w:ind w:firstLine="0"/>
-              <w:jc w:val="left"/>
-              <w:rPr>
-                <w:sz w:val="18"/>
-                <w:szCs w:val="18"/>
-              </w:rPr>
-            </w:pPr>
-            <w:r>
-              <w:rPr>
-                <w:i/>
-                <w:iCs/>
-                <w:szCs w:val="18"/>
-              </w:rPr>
-              <w:t>Lowest Level Heading.</w:t>
-            </w:r>
-            <w:r>
-              <w:rPr>
-                <w:szCs w:val="18"/>
-              </w:rPr>
-              <w:t xml:space="preserve"> Text follows</w:t>
-            </w:r>
-          </w:p>
-        </w:tc>
-        <w:tc>
-          <w:tcPr>
-            <w:tcW w:w="1724" w:type="dxa"/>
-            <w:tcBorders>
-              <w:bottom w:val="single" w:color="000000" w:sz="12" w:space="0"/>
-            </w:tcBorders>
-            <w:vAlign w:val="center"/>
-          </w:tcPr>
-          <w:p>
-            <w:pPr>
-              <w:ind w:firstLine="0"/>
-              <w:jc w:val="left"/>
-              <w:rPr>
-                <w:sz w:val="18"/>
-                <w:szCs w:val="18"/>
-              </w:rPr>
-            </w:pPr>
-            <w:r>
-              <w:rPr>
-                <w:sz w:val="18"/>
-                <w:szCs w:val="18"/>
-              </w:rPr>
-              <w:t>10 point, italic</w:t>
-            </w:r>
-          </w:p>
-        </w:tc>
-      </w:tr>
-    </w:tbl>
-    <w:p>
-      <w:pPr>
-        <w:spacing w:before="240"/>
-        <w:ind w:firstLine="0"/>
-      </w:pPr>
-      <w:r>
-        <w:t xml:space="preserve">Displayed equations are centered and set on a separate line. </w:t>
-      </w:r>
-    </w:p>
-    <w:p>
-      <w:pPr>
-        <w:pStyle w:val="23"/>
-      </w:pPr>
-      <w:r>
-        <w:rPr>
-          <w:i/>
-        </w:rPr>
-        <w:tab/>
-      </w:r>
-      <w:r>
-        <w:rPr>
-          <w:i/>
-        </w:rPr>
-        <w:t>x</w:t>
-      </w:r>
-      <w:r>
-        <w:t xml:space="preserve"> + </w:t>
-      </w:r>
-      <w:r>
-        <w:rPr>
-          <w:i/>
-        </w:rPr>
-        <w:t>y</w:t>
-      </w:r>
-      <w:r>
-        <w:t xml:space="preserve"> = </w:t>
-      </w:r>
-      <w:r>
-        <w:rPr>
-          <w:i/>
-        </w:rPr>
-        <w:t>z</w:t>
-      </w:r>
-      <w:r>
-        <w:tab/>
-      </w:r>
-      <w:r>
-        <w:t>(</w:t>
-      </w:r>
-      <w:r>
-        <w:fldChar w:fldCharType="begin"/>
-      </w:r>
-      <w:r>
-        <w:instrText xml:space="preserve"> SEQ "Equation" \n \* MERGEFORMAT </w:instrText>
-      </w:r>
-      <w:r>
-        <w:fldChar w:fldCharType="separate"/>
-      </w:r>
-      <w:r>
-        <w:t>1</w:t>
-      </w:r>
-      <w:r>
-        <w:fldChar w:fldCharType="end"/>
-      </w:r>
-      <w:bookmarkStart w:id="1" w:name="_Ref467511674"/>
-      <w:bookmarkEnd w:id="1"/>
-      <w:r>
-        <w:t>)</w:t>
-      </w:r>
-    </w:p>
-    <w:p>
-      <w:pPr>
-        <w:pStyle w:val="3"/>
-        <w:tabs>
-          <w:tab w:val="left" w:pos="1929"/>
-        </w:tabs>
-      </w:pPr>
-      <w:r>
-        <w:t xml:space="preserve">Please try to avoid rasterized images for line-art diagrams and schemas. Whenever possible, use vector graphics instead (see </w:t>
-      </w:r>
-      <w:r>
-        <w:fldChar w:fldCharType="begin"/>
-      </w:r>
-      <w:r>
-        <w:instrText xml:space="preserve"> REF _Ref467515387 \h  \* MERGEFORMAT </w:instrText>
-      </w:r>
-      <w:r>
-        <w:fldChar w:fldCharType="separate"/>
-      </w:r>
-      <w:r>
-        <w:t>Fig. 1</w:t>
-      </w:r>
-      <w:r>
-        <w:fldChar w:fldCharType="end"/>
-      </w:r>
-      <w:r>
-        <w:t>).</w:t>
-      </w:r>
-    </w:p>
-    <w:p>
-      <w:pPr>
-        <w:spacing w:before="360"/>
-        <w:ind w:left="227" w:hanging="227"/>
-      </w:pPr>
-      <w:r>
-        <w:rPr>
-          <w:lang w:val="en-IN" w:eastAsia="en-IN"/>
-        </w:rPr>
-        <w:drawing>
-          <wp:inline distT="0" distB="0" distL="0" distR="0">
-            <wp:extent cx="4392930" cy="1858645"/>
-            <wp:effectExtent l="0" t="0" r="7620" b="8255"/>
-            <wp:docPr id="1" name="Diagramm 1"/>
-            <wp:cNvGraphicFramePr/>
-            <a:graphic xmlns:a="http://schemas.openxmlformats.org/drawingml/2006/main">
-              <a:graphicData uri="http://schemas.openxmlformats.org/drawingml/2006/chart">
-                <c:chart xmlns:c="http://schemas.openxmlformats.org/drawingml/2006/chart" xmlns:r="http://schemas.openxmlformats.org/officeDocument/2006/relationships" r:id="rId10"/>
-              </a:graphicData>
-            </a:graphic>
-          </wp:inline>
-        </w:drawing>
-      </w:r>
-    </w:p>
-    <w:p>
-      <w:pPr>
-        <w:pStyle w:val="24"/>
-        <w:jc w:val="both"/>
-      </w:pPr>
-      <w:bookmarkStart w:id="2" w:name="_Ref467515387"/>
-      <w:r>
-        <w:rPr>
-          <w:b/>
-        </w:rPr>
-        <w:t xml:space="preserve">Fig. </w:t>
-      </w:r>
-      <w:r>
-        <w:fldChar w:fldCharType="begin"/>
-      </w:r>
-      <w:r>
-        <w:instrText xml:space="preserve"> SEQ "Figure" \* MERGEFORMAT </w:instrText>
-      </w:r>
-      <w:r>
-        <w:fldChar w:fldCharType="separate"/>
-      </w:r>
-      <w:r>
-        <w:rPr>
-          <w:b/>
-        </w:rPr>
-        <w:t>1</w:t>
-      </w:r>
-      <w:r>
-        <w:rPr>
-          <w:b/>
-        </w:rPr>
-        <w:fldChar w:fldCharType="end"/>
-      </w:r>
-      <w:bookmarkEnd w:id="2"/>
-      <w:r>
-        <w:rPr>
-          <w:b/>
-        </w:rPr>
-        <w:t>.</w:t>
-      </w:r>
-      <w:r>
-        <w:t xml:space="preserve"> A figure caption is always placed below the illustration. Short captions are centered, while long ones are justified. The macro button chooses the correct format automatically.</w:t>
-      </w:r>
-    </w:p>
-    <w:p>
-      <w:pPr>
-        <w:pStyle w:val="3"/>
-      </w:pPr>
-      <w:r>
-        <w:t>For citations of references, we prefer the use of square brackets and consecutive numbers. Citations using labels or the author/year convention are also acceptable. The following bibliography provides a sample reference list with entries for journal articles [1], an LNCS chapter [2], a book [3], proceedings without editors [4], as well as a URL [5].</w:t>
-      </w:r>
-    </w:p>
-    <w:p>
-      <w:pPr>
-        <w:pStyle w:val="25"/>
-        <w:numPr>
-          <w:ilvl w:val="0"/>
-          <w:numId w:val="0"/>
-        </w:numPr>
-        <w:ind w:left="567" w:hanging="567"/>
-      </w:pPr>
-      <w:r>
-        <w:t>References</w:t>
-      </w:r>
-    </w:p>
-    <w:p>
-      <w:pPr>
-        <w:pStyle w:val="33"/>
-      </w:pPr>
-      <w:r>
-        <w:t>Author, F.: Article title. Journal 2(5), 99–110 (2016).</w:t>
-      </w:r>
-    </w:p>
-    <w:p>
-      <w:pPr>
-        <w:pStyle w:val="33"/>
-      </w:pPr>
-      <w:r>
-        <w:t xml:space="preserve">Author, F., Author, S.: Title of a proceedings paper. In: Editor, F., Editor, S. (eds.) CONFERENCE 2016, LNCS, vol. 9999, pp. 1–13. Springer, Heidelberg (2016). </w:t>
-      </w:r>
-    </w:p>
-    <w:p>
-      <w:pPr>
-        <w:pStyle w:val="33"/>
-      </w:pPr>
-      <w:r>
-        <w:t>Author, F., Author, S., Author, T.: Book title. 2nd edn. Publisher, Location (1999).</w:t>
-      </w:r>
-    </w:p>
-    <w:p>
-      <w:pPr>
-        <w:pStyle w:val="33"/>
-      </w:pPr>
-      <w:r>
-        <w:t>Author, F.: Contribution title. In: 9th International Proceedings on Proceedings, pp. 1–2. Publisher, Location (2010).</w:t>
-      </w:r>
-    </w:p>
-    <w:p>
-      <w:pPr>
-        <w:pStyle w:val="33"/>
-      </w:pPr>
-      <w:r>
-        <w:t xml:space="preserve">LNCS Homepage, </w:t>
-      </w:r>
-      <w:r>
-        <w:fldChar w:fldCharType="begin"/>
-      </w:r>
-      <w:r>
-        <w:instrText xml:space="preserve"> HYPERLINK "http://www.springer.com/lncs" </w:instrText>
-      </w:r>
-      <w:r>
-        <w:fldChar w:fldCharType="separate"/>
-      </w:r>
-      <w:r>
-        <w:rPr>
-          <w:rStyle w:val="14"/>
-        </w:rPr>
-        <w:t>http://www.springer.com/lncs</w:t>
-      </w:r>
-      <w:r>
-        <w:rPr>
-          <w:rStyle w:val="14"/>
-        </w:rPr>
-        <w:fldChar w:fldCharType="end"/>
-      </w:r>
-      <w:r>
-        <w:t>, last accessed 2016/11/21.</w:t>
-      </w:r>
+      <w:pPr>
+        <w:ind w:left="0" w:leftChars="0" w:firstLine="0" w:firstLineChars="0"/>
+      </w:pPr>
     </w:p>
     <w:sectPr>
       <w:headerReference r:id="rId5" w:type="default"/>
@@ -4500,659 +3660,6 @@
     </w:rPr>
   </w:style>
 </w:styles>
-</file>
-
-<file path=word/charts/chart1.xml><?xml version="1.0" encoding="utf-8"?>
-<c:chartSpace xmlns:c="http://schemas.openxmlformats.org/drawingml/2006/chart" xmlns:a="http://schemas.openxmlformats.org/drawingml/2006/main" xmlns:r="http://schemas.openxmlformats.org/officeDocument/2006/relationships">
-  <c:date1904 val="0"/>
-  <c:lang val="zh-CN"/>
-  <c:roundedCorners val="0"/>
-  <mc:AlternateContent xmlns:mc="http://schemas.openxmlformats.org/markup-compatibility/2006">
-    <mc:Choice xmlns:c14="http://schemas.microsoft.com/office/drawing/2007/8/2/chart" Requires="c14">
-      <c14:style val="102"/>
-    </mc:Choice>
-    <mc:Fallback>
-      <c:style val="2"/>
-    </mc:Fallback>
-  </mc:AlternateContent>
-  <c:chart>
-    <c:autoTitleDeleted val="1"/>
-    <c:plotArea>
-      <c:layout>
-        <c:manualLayout>
-          <c:layoutTarget val="inner"/>
-          <c:xMode val="edge"/>
-          <c:yMode val="edge"/>
-          <c:x val="0.0507780059221542"/>
-          <c:y val="0.0514005540974045"/>
-          <c:w val="0.94049952150364"/>
-          <c:h val="0.832619568387285"/>
-        </c:manualLayout>
-      </c:layout>
-      <c:lineChart>
-        <c:grouping val="standard"/>
-        <c:varyColors val="0"/>
-        <c:ser>
-          <c:idx val="0"/>
-          <c:order val="0"/>
-          <c:tx>
-            <c:strRef>
-              <c:f>Tabelle1!$B$1</c:f>
-              <c:strCache>
-                <c:ptCount val="1"/>
-                <c:pt idx="0">
-                  <c:v>Data A</c:v>
-                </c:pt>
-              </c:strCache>
-            </c:strRef>
-          </c:tx>
-          <c:spPr>
-            <a:ln w="12700" cap="rnd" cmpd="sng" algn="ctr">
-              <a:solidFill>
-                <a:schemeClr val="tx1"/>
-              </a:solidFill>
-              <a:prstDash val="sysDash"/>
-              <a:round/>
-            </a:ln>
-          </c:spPr>
-          <c:marker>
-            <c:symbol val="none"/>
-          </c:marker>
-          <c:dLbls>
-            <c:delete val="1"/>
-          </c:dLbls>
-          <c:cat>
-            <c:numRef>
-              <c:f>Tabelle1!$A$2:$A$32</c:f>
-              <c:numCache>
-                <c:formatCode>General</c:formatCode>
-                <c:ptCount val="31"/>
-                <c:pt idx="0">
-                  <c:v>0</c:v>
-                </c:pt>
-                <c:pt idx="1">
-                  <c:v>1</c:v>
-                </c:pt>
-                <c:pt idx="2">
-                  <c:v>2</c:v>
-                </c:pt>
-                <c:pt idx="3">
-                  <c:v>3</c:v>
-                </c:pt>
-                <c:pt idx="4">
-                  <c:v>4</c:v>
-                </c:pt>
-                <c:pt idx="5">
-                  <c:v>5</c:v>
-                </c:pt>
-                <c:pt idx="6">
-                  <c:v>6</c:v>
-                </c:pt>
-                <c:pt idx="7">
-                  <c:v>7</c:v>
-                </c:pt>
-                <c:pt idx="8">
-                  <c:v>8</c:v>
-                </c:pt>
-                <c:pt idx="9">
-                  <c:v>9</c:v>
-                </c:pt>
-                <c:pt idx="10">
-                  <c:v>10</c:v>
-                </c:pt>
-                <c:pt idx="11">
-                  <c:v>11</c:v>
-                </c:pt>
-                <c:pt idx="12">
-                  <c:v>12</c:v>
-                </c:pt>
-                <c:pt idx="13">
-                  <c:v>13</c:v>
-                </c:pt>
-                <c:pt idx="14">
-                  <c:v>14</c:v>
-                </c:pt>
-                <c:pt idx="15">
-                  <c:v>15</c:v>
-                </c:pt>
-                <c:pt idx="16">
-                  <c:v>16</c:v>
-                </c:pt>
-                <c:pt idx="17">
-                  <c:v>17</c:v>
-                </c:pt>
-                <c:pt idx="18">
-                  <c:v>18</c:v>
-                </c:pt>
-                <c:pt idx="19">
-                  <c:v>19</c:v>
-                </c:pt>
-                <c:pt idx="20">
-                  <c:v>20</c:v>
-                </c:pt>
-                <c:pt idx="21">
-                  <c:v>21</c:v>
-                </c:pt>
-                <c:pt idx="22">
-                  <c:v>22</c:v>
-                </c:pt>
-                <c:pt idx="23">
-                  <c:v>23</c:v>
-                </c:pt>
-                <c:pt idx="24">
-                  <c:v>24</c:v>
-                </c:pt>
-                <c:pt idx="25">
-                  <c:v>25</c:v>
-                </c:pt>
-                <c:pt idx="26">
-                  <c:v>26</c:v>
-                </c:pt>
-                <c:pt idx="27">
-                  <c:v>27</c:v>
-                </c:pt>
-                <c:pt idx="28">
-                  <c:v>28</c:v>
-                </c:pt>
-                <c:pt idx="29">
-                  <c:v>29</c:v>
-                </c:pt>
-                <c:pt idx="30">
-                  <c:v>30</c:v>
-                </c:pt>
-              </c:numCache>
-            </c:numRef>
-          </c:cat>
-          <c:val>
-            <c:numRef>
-              <c:f>Tabelle1!$B$2:$B$32</c:f>
-              <c:numCache>
-                <c:formatCode>General</c:formatCode>
-                <c:ptCount val="31"/>
-                <c:pt idx="0">
-                  <c:v>0</c:v>
-                </c:pt>
-                <c:pt idx="1">
-                  <c:v>2</c:v>
-                </c:pt>
-                <c:pt idx="2">
-                  <c:v>1</c:v>
-                </c:pt>
-                <c:pt idx="3">
-                  <c:v>3</c:v>
-                </c:pt>
-                <c:pt idx="4">
-                  <c:v>4</c:v>
-                </c:pt>
-                <c:pt idx="5">
-                  <c:v>5</c:v>
-                </c:pt>
-                <c:pt idx="6">
-                  <c:v>7</c:v>
-                </c:pt>
-                <c:pt idx="7">
-                  <c:v>3</c:v>
-                </c:pt>
-                <c:pt idx="8">
-                  <c:v>5</c:v>
-                </c:pt>
-                <c:pt idx="9">
-                  <c:v>4</c:v>
-                </c:pt>
-                <c:pt idx="10">
-                  <c:v>8</c:v>
-                </c:pt>
-                <c:pt idx="11">
-                  <c:v>10</c:v>
-                </c:pt>
-                <c:pt idx="12">
-                  <c:v>11</c:v>
-                </c:pt>
-                <c:pt idx="13">
-                  <c:v>13</c:v>
-                </c:pt>
-                <c:pt idx="14">
-                  <c:v>16</c:v>
-                </c:pt>
-                <c:pt idx="15">
-                  <c:v>15</c:v>
-                </c:pt>
-                <c:pt idx="16">
-                  <c:v>12</c:v>
-                </c:pt>
-                <c:pt idx="17">
-                  <c:v>18</c:v>
-                </c:pt>
-                <c:pt idx="18">
-                  <c:v>19</c:v>
-                </c:pt>
-                <c:pt idx="19">
-                  <c:v>21</c:v>
-                </c:pt>
-                <c:pt idx="20">
-                  <c:v>8</c:v>
-                </c:pt>
-                <c:pt idx="21">
-                  <c:v>12</c:v>
-                </c:pt>
-                <c:pt idx="22">
-                  <c:v>11</c:v>
-                </c:pt>
-                <c:pt idx="23">
-                  <c:v>9</c:v>
-                </c:pt>
-                <c:pt idx="24">
-                  <c:v>13</c:v>
-                </c:pt>
-                <c:pt idx="25">
-                  <c:v>19</c:v>
-                </c:pt>
-                <c:pt idx="26">
-                  <c:v>26</c:v>
-                </c:pt>
-                <c:pt idx="27">
-                  <c:v>31</c:v>
-                </c:pt>
-                <c:pt idx="28">
-                  <c:v>32</c:v>
-                </c:pt>
-                <c:pt idx="29">
-                  <c:v>39</c:v>
-                </c:pt>
-                <c:pt idx="30">
-                  <c:v>45</c:v>
-                </c:pt>
-              </c:numCache>
-            </c:numRef>
-          </c:val>
-          <c:smooth val="0"/>
-        </c:ser>
-        <c:ser>
-          <c:idx val="1"/>
-          <c:order val="1"/>
-          <c:tx>
-            <c:strRef>
-              <c:f>Tabelle1!$C$1</c:f>
-              <c:strCache>
-                <c:ptCount val="1"/>
-                <c:pt idx="0">
-                  <c:v>Data B</c:v>
-                </c:pt>
-              </c:strCache>
-            </c:strRef>
-          </c:tx>
-          <c:spPr>
-            <a:ln w="12700" cap="rnd" cmpd="sng" algn="ctr">
-              <a:solidFill>
-                <a:schemeClr val="accent2">
-                  <a:shade val="95000"/>
-                  <a:satMod val="105000"/>
-                </a:schemeClr>
-              </a:solidFill>
-              <a:prstDash val="solid"/>
-              <a:round/>
-            </a:ln>
-          </c:spPr>
-          <c:marker>
-            <c:symbol val="none"/>
-          </c:marker>
-          <c:dLbls>
-            <c:delete val="1"/>
-          </c:dLbls>
-          <c:cat>
-            <c:numRef>
-              <c:f>Tabelle1!$A$2:$A$32</c:f>
-              <c:numCache>
-                <c:formatCode>General</c:formatCode>
-                <c:ptCount val="31"/>
-                <c:pt idx="0">
-                  <c:v>0</c:v>
-                </c:pt>
-                <c:pt idx="1">
-                  <c:v>1</c:v>
-                </c:pt>
-                <c:pt idx="2">
-                  <c:v>2</c:v>
-                </c:pt>
-                <c:pt idx="3">
-                  <c:v>3</c:v>
-                </c:pt>
-                <c:pt idx="4">
-                  <c:v>4</c:v>
-                </c:pt>
-                <c:pt idx="5">
-                  <c:v>5</c:v>
-                </c:pt>
-                <c:pt idx="6">
-                  <c:v>6</c:v>
-                </c:pt>
-                <c:pt idx="7">
-                  <c:v>7</c:v>
-                </c:pt>
-                <c:pt idx="8">
-                  <c:v>8</c:v>
-                </c:pt>
-                <c:pt idx="9">
-                  <c:v>9</c:v>
-                </c:pt>
-                <c:pt idx="10">
-                  <c:v>10</c:v>
-                </c:pt>
-                <c:pt idx="11">
-                  <c:v>11</c:v>
-                </c:pt>
-                <c:pt idx="12">
-                  <c:v>12</c:v>
-                </c:pt>
-                <c:pt idx="13">
-                  <c:v>13</c:v>
-                </c:pt>
-                <c:pt idx="14">
-                  <c:v>14</c:v>
-                </c:pt>
-                <c:pt idx="15">
-                  <c:v>15</c:v>
-                </c:pt>
-                <c:pt idx="16">
-                  <c:v>16</c:v>
-                </c:pt>
-                <c:pt idx="17">
-                  <c:v>17</c:v>
-                </c:pt>
-                <c:pt idx="18">
-                  <c:v>18</c:v>
-                </c:pt>
-                <c:pt idx="19">
-                  <c:v>19</c:v>
-                </c:pt>
-                <c:pt idx="20">
-                  <c:v>20</c:v>
-                </c:pt>
-                <c:pt idx="21">
-                  <c:v>21</c:v>
-                </c:pt>
-                <c:pt idx="22">
-                  <c:v>22</c:v>
-                </c:pt>
-                <c:pt idx="23">
-                  <c:v>23</c:v>
-                </c:pt>
-                <c:pt idx="24">
-                  <c:v>24</c:v>
-                </c:pt>
-                <c:pt idx="25">
-                  <c:v>25</c:v>
-                </c:pt>
-                <c:pt idx="26">
-                  <c:v>26</c:v>
-                </c:pt>
-                <c:pt idx="27">
-                  <c:v>27</c:v>
-                </c:pt>
-                <c:pt idx="28">
-                  <c:v>28</c:v>
-                </c:pt>
-                <c:pt idx="29">
-                  <c:v>29</c:v>
-                </c:pt>
-                <c:pt idx="30">
-                  <c:v>30</c:v>
-                </c:pt>
-              </c:numCache>
-            </c:numRef>
-          </c:cat>
-          <c:val>
-            <c:numRef>
-              <c:f>Tabelle1!$C$2:$C$32</c:f>
-              <c:numCache>
-                <c:formatCode>General</c:formatCode>
-                <c:ptCount val="31"/>
-                <c:pt idx="0">
-                  <c:v>16</c:v>
-                </c:pt>
-                <c:pt idx="1">
-                  <c:v>13</c:v>
-                </c:pt>
-                <c:pt idx="2">
-                  <c:v>14</c:v>
-                </c:pt>
-                <c:pt idx="3">
-                  <c:v>15</c:v>
-                </c:pt>
-                <c:pt idx="4">
-                  <c:v>17</c:v>
-                </c:pt>
-                <c:pt idx="5">
-                  <c:v>16.5</c:v>
-                </c:pt>
-                <c:pt idx="6">
-                  <c:v>18</c:v>
-                </c:pt>
-                <c:pt idx="7">
-                  <c:v>19.3</c:v>
-                </c:pt>
-                <c:pt idx="8">
-                  <c:v>12.4</c:v>
-                </c:pt>
-                <c:pt idx="9">
-                  <c:v>14.6</c:v>
-                </c:pt>
-                <c:pt idx="10">
-                  <c:v>16.5</c:v>
-                </c:pt>
-                <c:pt idx="11">
-                  <c:v>15.3</c:v>
-                </c:pt>
-                <c:pt idx="12">
-                  <c:v>14</c:v>
-                </c:pt>
-                <c:pt idx="13">
-                  <c:v>14.7</c:v>
-                </c:pt>
-                <c:pt idx="14">
-                  <c:v>13.9</c:v>
-                </c:pt>
-                <c:pt idx="15">
-                  <c:v>12.2</c:v>
-                </c:pt>
-                <c:pt idx="16">
-                  <c:v>16.8</c:v>
-                </c:pt>
-                <c:pt idx="17">
-                  <c:v>17.1</c:v>
-                </c:pt>
-                <c:pt idx="18">
-                  <c:v>19.2</c:v>
-                </c:pt>
-                <c:pt idx="19">
-                  <c:v>18.25</c:v>
-                </c:pt>
-                <c:pt idx="20">
-                  <c:v>22</c:v>
-                </c:pt>
-                <c:pt idx="21" c:formatCode="#.##000_ ;\-#.##000\ ">
-                  <c:v>24</c:v>
-                </c:pt>
-                <c:pt idx="22" c:formatCode="#.##000_ ;\-#.##000\ ">
-                  <c:v>25</c:v>
-                </c:pt>
-                <c:pt idx="23" c:formatCode="#.##000_ ;\-#.##000\ ">
-                  <c:v>23.5</c:v>
-                </c:pt>
-                <c:pt idx="24" c:formatCode="#.##000_ ;\-#.##000\ ">
-                  <c:v>21</c:v>
-                </c:pt>
-                <c:pt idx="25" c:formatCode="#.##000_ ;\-#.##000\ ">
-                  <c:v>16.9</c:v>
-                </c:pt>
-                <c:pt idx="26" c:formatCode="#.##000_ ;\-#.##000\ ">
-                  <c:v>17.5</c:v>
-                </c:pt>
-                <c:pt idx="27" c:formatCode="#.##000_ ;\-#.##000\ ">
-                  <c:v>18.2</c:v>
-                </c:pt>
-                <c:pt idx="28" c:formatCode="#.##000_ ;\-#.##000\ ">
-                  <c:v>19.1</c:v>
-                </c:pt>
-                <c:pt idx="29" c:formatCode="#.##000_ ;\-#.##000\ ">
-                  <c:v>14.8</c:v>
-                </c:pt>
-                <c:pt idx="30" c:formatCode="#.##000_ ;\-#.##000\ ">
-                  <c:v>15.2</c:v>
-                </c:pt>
-              </c:numCache>
-            </c:numRef>
-          </c:val>
-          <c:smooth val="0"/>
-        </c:ser>
-        <c:dLbls>
-          <c:showLegendKey val="0"/>
-          <c:showVal val="0"/>
-          <c:showCatName val="0"/>
-          <c:showSerName val="0"/>
-          <c:showPercent val="0"/>
-          <c:showBubbleSize val="0"/>
-        </c:dLbls>
-        <c:marker val="0"/>
-        <c:smooth val="0"/>
-        <c:axId val="148488576"/>
-        <c:axId val="148490112"/>
-      </c:lineChart>
-      <c:catAx>
-        <c:axId val="148488576"/>
-        <c:scaling>
-          <c:orientation val="minMax"/>
-        </c:scaling>
-        <c:delete val="0"/>
-        <c:axPos val="b"/>
-        <c:numFmt formatCode="General" sourceLinked="1"/>
-        <c:majorTickMark val="out"/>
-        <c:minorTickMark val="none"/>
-        <c:tickLblPos val="nextTo"/>
-        <c:txPr>
-          <a:bodyPr rot="-60000000" spcFirstLastPara="0" vertOverflow="ellipsis" vert="horz" wrap="square" anchor="ctr" anchorCtr="1"/>
-          <a:lstStyle/>
-          <a:p>
-            <a:pPr>
-              <a:defRPr lang="en-US" sz="800" b="0" i="0" u="none" strike="noStrike" kern="1200" baseline="0">
-                <a:solidFill>
-                  <a:schemeClr val="tx1"/>
-                </a:solidFill>
-                <a:latin typeface="+mn-lt"/>
-                <a:ea typeface="+mn-ea"/>
-                <a:cs typeface="+mn-cs"/>
-              </a:defRPr>
-            </a:pPr>
-          </a:p>
-        </c:txPr>
-        <c:crossAx val="148490112"/>
-        <c:crosses val="autoZero"/>
-        <c:auto val="1"/>
-        <c:lblAlgn val="ctr"/>
-        <c:lblOffset val="100"/>
-        <c:tickLblSkip val="5"/>
-        <c:noMultiLvlLbl val="0"/>
-      </c:catAx>
-      <c:valAx>
-        <c:axId val="148490112"/>
-        <c:scaling>
-          <c:orientation val="minMax"/>
-        </c:scaling>
-        <c:delete val="0"/>
-        <c:axPos val="l"/>
-        <c:majorGridlines>
-          <c:spPr>
-            <a:ln w="9525" cap="flat" cmpd="sng" algn="ctr">
-              <a:noFill/>
-              <a:prstDash val="solid"/>
-              <a:round/>
-            </a:ln>
-          </c:spPr>
-        </c:majorGridlines>
-        <c:numFmt formatCode="General" sourceLinked="1"/>
-        <c:majorTickMark val="out"/>
-        <c:minorTickMark val="none"/>
-        <c:tickLblPos val="nextTo"/>
-        <c:txPr>
-          <a:bodyPr rot="-60000000" spcFirstLastPara="0" vertOverflow="ellipsis" vert="horz" wrap="square" anchor="ctr" anchorCtr="1"/>
-          <a:lstStyle/>
-          <a:p>
-            <a:pPr>
-              <a:defRPr lang="en-US" sz="800" b="0" i="0" u="none" strike="noStrike" kern="1200" baseline="0">
-                <a:solidFill>
-                  <a:schemeClr val="tx1"/>
-                </a:solidFill>
-                <a:latin typeface="+mn-lt"/>
-                <a:ea typeface="+mn-ea"/>
-                <a:cs typeface="+mn-cs"/>
-              </a:defRPr>
-            </a:pPr>
-          </a:p>
-        </c:txPr>
-        <c:crossAx val="148488576"/>
-        <c:crossesAt val="1"/>
-        <c:crossBetween val="midCat"/>
-      </c:valAx>
-    </c:plotArea>
-    <c:legend>
-      <c:legendPos val="r"/>
-      <c:layout>
-        <c:manualLayout>
-          <c:xMode val="edge"/>
-          <c:yMode val="edge"/>
-          <c:x val="0.139603222148048"/>
-          <c:y val="0.16628280839895"/>
-          <c:w val="0.190301595637834"/>
-          <c:h val="0.1674343832021"/>
-        </c:manualLayout>
-      </c:layout>
-      <c:overlay val="0"/>
-      <c:txPr>
-        <a:bodyPr rot="0" spcFirstLastPara="0" vertOverflow="ellipsis" vert="horz" wrap="square" anchor="ctr" anchorCtr="1"/>
-        <a:lstStyle/>
-        <a:p>
-          <a:pPr>
-            <a:defRPr lang="en-US" sz="800" b="0" i="0" u="none" strike="noStrike" kern="1200" baseline="0">
-              <a:solidFill>
-                <a:schemeClr val="tx1"/>
-              </a:solidFill>
-              <a:latin typeface="+mn-lt"/>
-              <a:ea typeface="+mn-ea"/>
-              <a:cs typeface="+mn-cs"/>
-            </a:defRPr>
-          </a:pPr>
-        </a:p>
-      </c:txPr>
-    </c:legend>
-    <c:plotVisOnly val="1"/>
-    <c:dispBlanksAs val="gap"/>
-    <c:showDLblsOverMax val="0"/>
-    <c:extLst>
-      <c:ext uri="{0b15fc19-7d7d-44ad-8c2d-2c3a37ce22c3}">
-        <chartProps xmlns="https://web.wps.cn/et/2018/main" chartId="{cfc21859-7e24-4951-8b2f-6db2059b3e30}"/>
-      </c:ext>
-    </c:extLst>
-  </c:chart>
-  <c:spPr>
-    <a:ln w="9525" cap="flat" cmpd="sng" algn="ctr">
-      <a:noFill/>
-      <a:prstDash val="solid"/>
-      <a:round/>
-    </a:ln>
-  </c:spPr>
-  <c:txPr>
-    <a:bodyPr/>
-    <a:lstStyle/>
-    <a:p>
-      <a:pPr>
-        <a:defRPr lang="en-US" sz="800"/>
-      </a:pPr>
-    </a:p>
-  </c:txPr>
-  <c:externalData r:id="rId1">
-    <c:autoUpdate val="0"/>
-  </c:externalData>
-</c:chartSpace>
 </file>
 
 <file path=word/theme/theme1.xml><?xml version="1.0" encoding="utf-8"?>

</xml_diff>

<commit_message>
docs: update FRP project manuscripts, reports, and presentation materials including new AI report
</commit_message>
<xml_diff>
--- a/SEM_8/FRP/FRP Manuscript.docx
+++ b/SEM_8/FRP/FRP Manuscript.docx
@@ -486,11 +486,6 @@
       </w:r>
       <w:r>
         <w:t>.</w:t>
-      </w:r>
-    </w:p>
-    <w:p>
-      <w:r>
-        <w:br w:type="page"/>
       </w:r>
     </w:p>
     <w:p>
@@ -686,27 +681,12 @@
       <w:pPr>
         <w:pStyle w:val="3"/>
         <w:ind w:left="1200" w:leftChars="600" w:firstLine="0" w:firstLineChars="0"/>
-        <w:rPr>
-          <w:rFonts w:hint="default"/>
-        </w:rPr>
       </w:pPr>
       <w:r>
         <w:rPr>
           <w:rFonts w:hint="default"/>
         </w:rPr>
         <w:t>The remainder of this manuscript is structured as follows. Section 2 reviews existing literature and identifies prevailing research gaps. Section 3 details the proposed hybrid system architecture, dataset descriptions, and the adopted methodologies. Section 4 presents the experimental setup, empirical results on the CredData benchmark, and a critical performance analysis regarding inference latency. Finally, Section 5 concludes the research and outlines future operational directives.</w:t>
-      </w:r>
-    </w:p>
-    <w:p>
-      <w:pPr>
-        <w:rPr>
-          <w:rFonts w:hint="default"/>
-        </w:rPr>
-      </w:pPr>
-    </w:p>
-    <w:p>
-      <w:r>
-        <w:br w:type="page"/>
       </w:r>
     </w:p>
     <w:p>
@@ -737,7 +717,7 @@
           <w:vertAlign w:val="superscript"/>
           <w:lang w:val="en-US"/>
         </w:rPr>
-        <w:t>[1]</w:t>
+        <w:t>[6]</w:t>
       </w:r>
       <w:r>
         <w:rPr>
@@ -751,7 +731,7 @@
           <w:vertAlign w:val="superscript"/>
           <w:lang w:val="en-US"/>
         </w:rPr>
-        <w:t>[1]</w:t>
+        <w:t>[6]</w:t>
       </w:r>
       <w:r>
         <w:rPr>
@@ -765,13 +745,76 @@
           <w:vertAlign w:val="superscript"/>
           <w:lang w:val="en-US"/>
         </w:rPr>
+        <w:t>[7]</w:t>
+      </w:r>
+      <w:r>
+        <w:rPr>
+          <w:rFonts w:hint="default"/>
+        </w:rPr>
+        <w:t xml:space="preserve"> highlighted how the current generation of deep learning and NLP methods suffers from poor explainability, ambiguous definitions of concepts, and dataset bias. Lastly, in his work on the adaptation of LLMs, Jin (2025)</w:t>
+      </w:r>
+      <w:r>
+        <w:rPr>
+          <w:rFonts w:hint="default"/>
+          <w:vertAlign w:val="superscript"/>
+          <w:lang w:val="en-US"/>
+        </w:rPr>
+        <w:t>[4]</w:t>
+      </w:r>
+      <w:r>
+        <w:rPr>
+          <w:rFonts w:hint="default"/>
+        </w:rPr>
+        <w:t xml:space="preserve"> described various approaches, among which include base application, static augmentation, RAG, and hybrid fusion.</w:t>
+      </w:r>
+    </w:p>
+    <w:p>
+      <w:pPr>
+        <w:rPr>
+          <w:rFonts w:hint="default"/>
+        </w:rPr>
+      </w:pPr>
+    </w:p>
+    <w:p>
+      <w:pPr>
+        <w:ind w:left="600" w:leftChars="300" w:firstLine="0" w:firstLineChars="0"/>
+        <w:rPr>
+          <w:rFonts w:hint="default"/>
+        </w:rPr>
+      </w:pPr>
+      <w:r>
+        <w:rPr>
+          <w:rFonts w:hint="default"/>
+        </w:rPr>
+        <w:t>Recent efforts have tried to direct the attention of LLMs towards localized semantics to overcome context blindness. Li et al. (2025)</w:t>
+      </w:r>
+      <w:r>
+        <w:rPr>
+          <w:rFonts w:hint="default"/>
+          <w:vertAlign w:val="superscript"/>
+          <w:lang w:val="en-US"/>
+        </w:rPr>
+        <w:t>[2]</w:t>
+      </w:r>
+      <w:r>
+        <w:rPr>
+          <w:rFonts w:hint="default"/>
+        </w:rPr>
+        <w:t xml:space="preserve"> obtained a boost in their F1-score of 12.86% by directly injecting vulnerability steering vectors into LLM activation layers using actual data. However, current techniques for representation are mainly based on file semantics rather than identifying localized vulnerabilities. Kim et al. (2025)</w:t>
+      </w:r>
+      <w:r>
+        <w:rPr>
+          <w:rFonts w:hint="default"/>
+          <w:vertAlign w:val="superscript"/>
+          <w:lang w:val="en-US"/>
+        </w:rPr>
         <w:t>[3]</w:t>
       </w:r>
       <w:r>
         <w:rPr>
           <w:rFonts w:hint="default"/>
         </w:rPr>
-        <w:t xml:space="preserve"> highlighted how the current generation of deep learning and NLP methods suffers from poor explainability, ambiguous definitions of concepts, and dataset bias. Lastly, in his work on the adaptation of LLMs, Jin (2025)</w:t>
+        <w:t xml:space="preserve"> further validated this issue by implementing reinforcement learning to identify contextual signals, highlighting how conventional LLM models inherently fail when faced with vague tasks requiring context extraction. Classical data flow models, as presented by Muske and Khedker (2015)</w:t>
       </w:r>
       <w:r>
         <w:rPr>
@@ -779,21 +822,14 @@
           <w:vertAlign w:val="superscript"/>
           <w:lang w:val="en-US"/>
         </w:rPr>
-        <w:t>[4]</w:t>
-      </w:r>
-      <w:r>
-        <w:rPr>
-          <w:rFonts w:hint="default"/>
-        </w:rPr>
-        <w:t xml:space="preserve"> described various approaches, among which include base application, static augmentation, RAG, and hybrid fusion.</w:t>
-      </w:r>
-    </w:p>
-    <w:p>
-      <w:pPr>
-        <w:rPr>
-          <w:rFonts w:hint="default"/>
-        </w:rPr>
-      </w:pPr>
+        <w:t>[8]</w:t>
+      </w:r>
+      <w:r>
+        <w:rPr>
+          <w:rFonts w:hint="default"/>
+        </w:rPr>
+        <w:t>, were able to accelerate processing speeds by reducing model check calls; however, they lacked detection accuracy because of path over-approximation.</w:t>
+      </w:r>
     </w:p>
     <w:p>
       <w:pPr>
@@ -802,11 +838,19 @@
           <w:rFonts w:hint="default"/>
         </w:rPr>
       </w:pPr>
-      <w:r>
-        <w:rPr>
-          <w:rFonts w:hint="default"/>
-        </w:rPr>
-        <w:t>Recent efforts have tried to direct the attention of LLMs towards localized semantics to overcome context blindness. Li et al. (2025)</w:t>
+    </w:p>
+    <w:p>
+      <w:pPr>
+        <w:ind w:left="600" w:leftChars="300" w:firstLine="0" w:firstLineChars="0"/>
+        <w:rPr>
+          <w:rFonts w:hint="default"/>
+        </w:rPr>
+      </w:pPr>
+      <w:r>
+        <w:rPr>
+          <w:rFonts w:hint="default"/>
+        </w:rPr>
+        <w:t>Crucially, empirically derived tests have identified serious problems in the way LLM security benchmarks are being assessed. In a startling finding, Dozono et al. (2025)</w:t>
       </w:r>
       <w:r>
         <w:rPr>
@@ -814,77 +858,21 @@
           <w:vertAlign w:val="superscript"/>
           <w:lang w:val="en-US"/>
         </w:rPr>
-        <w:t>[6]</w:t>
-      </w:r>
-      <w:r>
-        <w:rPr>
-          <w:rFonts w:hint="default"/>
-        </w:rPr>
-        <w:t xml:space="preserve"> obtained a boost in their F1-score of 12.86% by directly injecting vulnerability steering vectors into LLM activation layers using actual data. However, current techniques for representation are mainly based on file semantics rather than identifying localized vulnerabilities. Kim et al. (2025)</w:t>
-      </w:r>
-      <w:r>
-        <w:rPr>
-          <w:rFonts w:hint="default"/>
-          <w:vertAlign w:val="superscript"/>
-          <w:lang w:val="en-US"/>
-        </w:rPr>
-        <w:t>[5]</w:t>
-      </w:r>
-      <w:r>
-        <w:rPr>
-          <w:rFonts w:hint="default"/>
-        </w:rPr>
-        <w:t xml:space="preserve"> further validated this issue by implementing reinforcement learning to identify contextual signals, highlighting how conventional LLM models inherently fail when faced with vague tasks requiring context extraction. Classical data flow models, as presented by Muske and Khedker (2015)</w:t>
-      </w:r>
-      <w:r>
-        <w:rPr>
-          <w:rFonts w:hint="default"/>
-          <w:vertAlign w:val="superscript"/>
-          <w:lang w:val="en-US"/>
-        </w:rPr>
-        <w:t>[7]</w:t>
-      </w:r>
-      <w:r>
-        <w:rPr>
-          <w:rFonts w:hint="default"/>
-        </w:rPr>
-        <w:t>, were able to accelerate processing speeds by reducing model check calls; however, they lacked detection accuracy because of path over-approximation.</w:t>
-      </w:r>
-    </w:p>
-    <w:p>
-      <w:pPr>
-        <w:ind w:left="600" w:leftChars="300" w:firstLine="0" w:firstLineChars="0"/>
-        <w:rPr>
-          <w:rFonts w:hint="default"/>
-        </w:rPr>
-      </w:pPr>
-    </w:p>
-    <w:p>
-      <w:pPr>
-        <w:ind w:left="600" w:leftChars="300" w:firstLine="0" w:firstLineChars="0"/>
-        <w:rPr>
-          <w:rFonts w:hint="default"/>
-        </w:rPr>
-      </w:pPr>
-      <w:r>
-        <w:rPr>
-          <w:rFonts w:hint="default"/>
-        </w:rPr>
-        <w:t>Crucially, empirically derived tests have identified serious problems in the way LLM security benchmarks are being assessed. In a startling finding, Dozono et al. (2025)</w:t>
-      </w:r>
-      <w:r>
-        <w:rPr>
-          <w:rFonts w:hint="default"/>
-          <w:vertAlign w:val="superscript"/>
-          <w:lang w:val="en-US"/>
-        </w:rPr>
-        <w:t>[2]</w:t>
+        <w:t>[5</w:t>
       </w:r>
       <w:bookmarkStart w:id="0" w:name="_GoBack"/>
       <w:bookmarkEnd w:id="0"/>
       <w:r>
         <w:rPr>
           <w:rFonts w:hint="default"/>
+          <w:vertAlign w:val="superscript"/>
+          <w:lang w:val="en-US"/>
+        </w:rPr>
+        <w:t>]</w:t>
+      </w:r>
+      <w:r>
+        <w:rPr>
+          <w:rFonts w:hint="default"/>
         </w:rPr>
         <w:t xml:space="preserve"> found a devastating decline in accuracy from 56% in open source software to 34% in closed source commercial software, indicating that present day LLM security is overstated owing to contaminated training data sets. Lastly, moving LLM defenses solely to a reactive defense mechanism makes systems highly vulnerable to prompt injection attacks, requiring pre-inference structural verification.</w:t>
       </w:r>
@@ -910,14 +898,6 @@
         </w:rPr>
         <w:t>Together, these studies identify three key knowledge gaps, namely extreme token ineffectiveness during the analysis of the complete repository, “context blindness” arising out of the inability to isolate semantics at the line level, and zero-trust violations due to the transmission of proprietary code to cloud-based LLM APIs. Such limitations mandate a local hybrid framework.</w:t>
       </w:r>
-    </w:p>
-    <w:p>
-      <w:pPr>
-        <w:ind w:left="600" w:leftChars="300" w:firstLine="0" w:firstLineChars="0"/>
-        <w:rPr>
-          <w:rFonts w:hint="default"/>
-        </w:rPr>
-      </w:pPr>
     </w:p>
     <w:p>
       <w:pPr>
@@ -1304,10 +1284,6 @@
           <w:tab w:val="clear" w:pos="420"/>
         </w:tabs>
         <w:ind w:left="1598" w:leftChars="590" w:hanging="418" w:hangingChars="209"/>
-        <w:rPr>
-          <w:rFonts w:hint="default"/>
-          <w:lang w:val="en-US"/>
-        </w:rPr>
       </w:pPr>
       <w:r>
         <w:rPr>
@@ -1324,11 +1300,6 @@
           <w:lang w:val="en-US"/>
         </w:rPr>
         <w:t xml:space="preserve"> In order to address latency in inference, a rigid few-shot prompt template was devised. The inputting of highly deterministic examples before inference enabled the system to avoid any reasoning cycles and imposed a JSON schema for outputs that were categorized as either SAFE, REQUIRE_MANUAL_REVIEW, or CRITICAL.</w:t>
-      </w:r>
-    </w:p>
-    <w:p>
-      <w:r>
-        <w:br w:type="page"/>
       </w:r>
     </w:p>
     <w:p>
@@ -1628,10 +1599,6 @@
       <w:pPr>
         <w:pStyle w:val="3"/>
         <w:ind w:left="1200" w:leftChars="600" w:firstLine="0" w:firstLineChars="0"/>
-        <w:rPr>
-          <w:rFonts w:hint="default"/>
-          <w:lang w:val="en-US"/>
-        </w:rPr>
       </w:pPr>
       <w:r>
         <w:rPr>
@@ -1646,11 +1613,6 @@
           <w:lang w:val="en-US"/>
         </w:rPr>
         <w:t>More importantly, the successful implementation of this pipeline through the use of the Apple MLX framework creates a mathematically sound model for Zero-Trust DevSecOps. This demonstrates that highly advanced semantic verification can indeed be done on the local machine itself, thus precluding the need for sending proprietary source code to an external cloud-based API. Nevertheless, the observed 3.5 hours required for processing 1,000 secret candidates makes the stark truth clear that although the semantic verification process is indeed quite reliable, it is presently impossible to use it for real-time CI/CD integration.</w:t>
-      </w:r>
-    </w:p>
-    <w:p>
-      <w:r>
-        <w:br w:type="page"/>
       </w:r>
     </w:p>
     <w:p>
@@ -1713,16 +1675,11 @@
     </w:p>
     <w:p>
       <w:pPr>
+        <w:ind w:left="0" w:leftChars="0" w:firstLine="0" w:firstLineChars="0"/>
         <w:rPr>
           <w:b/>
         </w:rPr>
       </w:pPr>
-      <w:r>
-        <w:rPr>
-          <w:b/>
-        </w:rPr>
-        <w:br w:type="page"/>
-      </w:r>
     </w:p>
     <w:p>
       <w:pPr>
@@ -1761,7 +1718,7 @@
         <w:rPr>
           <w:rFonts w:hint="default"/>
         </w:rPr>
-        <w:t>Apostolidis, G. D., Kalouptsoglou, I., Siavvas, M., Kehagias, D., and Tzovaras, D. (2025) 'AI-Enhanced Static Analysis: Reducing False Alarms Using Large Language Models', 2025 IEEE International Conference on Smart Computing (SMARTCOMP).</w:t>
+        <w:t>Schwarz, D. (2025) 'Countermind: A Multi-Layered Security Architecture for Large Language Models', arXiv preprint arXiv:2510.11837v1.</w:t>
       </w:r>
     </w:p>
     <w:p>
@@ -1779,7 +1736,7 @@
         <w:rPr>
           <w:rFonts w:hint="default"/>
         </w:rPr>
-        <w:t xml:space="preserve">Dozono, K., Engesser, J., Hummelt, B., Roehm, T., and Pretschner, A. (2025) 'Should We Evaluate LLM Based Security Analysis Approaches on Open Source Systems?', 2025 40th IEEE/ACM International Conference on Automated Software Engineering (ASE). </w:t>
+        <w:t>Li, J. et al. (2025) 'Steering Large Language Models for Vulnerability Detection', 2025 IEEE International Conference on Acoustics, Speech and Signal Processing (ICASSP).</w:t>
       </w:r>
     </w:p>
     <w:p>
@@ -1797,7 +1754,7 @@
         <w:rPr>
           <w:rFonts w:hint="default"/>
         </w:rPr>
-        <w:t xml:space="preserve">Guo, Z. et al. (2023) 'Mitigating False Positive Static Analysis Warnings: Progress, Challenges, and Opportunities', IEEE Transactions on Software Engineering, Vol. 49, No. 12, pp. 5154-5186. </w:t>
+        <w:t>Kim, M., Caccia, L., Shi, Z., Pereira, M., Côté, M.-A., Yuan, X., and Sordoni, A. (2025) 'Learning to Extract Context for Context-Aware LLM Inference', Microsoft Research.</w:t>
       </w:r>
     </w:p>
     <w:p>
@@ -1815,7 +1772,7 @@
         <w:rPr>
           <w:rFonts w:hint="default"/>
         </w:rPr>
-        <w:t xml:space="preserve">Jin, S. (2025) 'Large Language Models for Vulnerability Detection in Static Code Analysis: A Survey', 2025 8th International Conference on Artificial Intelligence and Big Data (ICAIBD). </w:t>
+        <w:t>Jin, S. (2025) 'Large Language Models for Vulnerability Detection in Static Code Analysis: A Survey', 2025 8th International Conference on Artificial Intelligence and Big Data (ICAIBD).</w:t>
       </w:r>
     </w:p>
     <w:p>
@@ -1833,7 +1790,7 @@
         <w:rPr>
           <w:rFonts w:hint="default"/>
         </w:rPr>
-        <w:t xml:space="preserve">Kim, M., Caccia, L., Shi, Z., Pereira, M., Côté, M.-A., Yuan, X., and Sordoni, A. (2025) 'Learning to Extract Context for Context-Aware LLM Inference', Microsoft Research. </w:t>
+        <w:t>Dozono, K., Engesser, J., Hummelt, B., Roehm, T., and Pretschner, A. (2025) 'Should We Evaluate LLM Based Security Analysis Approaches on Open Source Systems?', 2025 40th IEEE/ACM International Conference on Automated Software Engineering (ASE).</w:t>
       </w:r>
     </w:p>
     <w:p>
@@ -1851,7 +1808,7 @@
         <w:rPr>
           <w:rFonts w:hint="default"/>
         </w:rPr>
-        <w:t xml:space="preserve">Li, J. et al. (2025) 'Steering Large Language Models for Vulnerability Detection', 2025 IEEE International Conference on Acoustics, Speech and Signal Processing (ICASSP). </w:t>
+        <w:t>Apostolidis, G. D., Kalouptsoglou, I., Siavvas, M., Kehagias, D., and Tzovaras, D. (2025) 'AI-Enhanced Static Analysis: Reducing False Alarms Using Large Language Models', 2025 IEEE International Conference on Smart Computing (SMARTCOMP).</w:t>
       </w:r>
     </w:p>
     <w:p>
@@ -1866,7 +1823,7 @@
         <w:rPr>
           <w:rFonts w:hint="default"/>
         </w:rPr>
-        <w:t xml:space="preserve">Muske, T. and Khedker, U. P. (2015) 'Efficient Elimination of False Positives using Static Analysis', 2015 IEEE. </w:t>
+        <w:t>Guo, Z. et al. (2023) 'Mitigating False Positive Static Analysis Warnings: Progress, Challenges, and Opportunities', IEEE Transactions on Software Engineering, Vol. 49, No. 12, pp. 5154-5186.</w:t>
       </w:r>
     </w:p>
     <w:p>
@@ -1881,27 +1838,8 @@
         <w:rPr>
           <w:rFonts w:hint="default"/>
         </w:rPr>
-        <w:t>Schwarz, D. (2025) 'Countermind: A Multi-Layered Security Architecture for Large Language Models', arXiv preprint arXiv:2510.11837v1.</w:t>
-      </w:r>
-    </w:p>
-    <w:p/>
-    <w:p/>
-    <w:p/>
-    <w:p/>
-    <w:p/>
-    <w:p/>
-    <w:p/>
-    <w:p/>
-    <w:p/>
-    <w:p/>
-    <w:p/>
-    <w:p/>
-    <w:p/>
-    <w:p/>
-    <w:p>
-      <w:pPr>
-        <w:ind w:left="0" w:leftChars="0" w:firstLine="0" w:firstLineChars="0"/>
-      </w:pPr>
+        <w:t>Muske, T. and Khedker, U. P. (2015) 'Efficient Elimination of False Positives using Static Analysis', 2015 IEEE.</w:t>
+      </w:r>
     </w:p>
     <w:sectPr>
       <w:headerReference r:id="rId5" w:type="default"/>

</xml_diff>